<commit_message>
Hareke düzeltmesi: kamerî lam, özel isim, soru edatı, min/an ve şedde sırası (37.315 yer)
</commit_message>
<xml_diff>
--- a/dosyalar/10-sinif/arapca-10-1d1y-beceri.docx
+++ b/dosyalar/10-sinif/arapca-10-1d1y-beceri.docx
@@ -522,7 +522,7 @@
                 <w:szCs w:val="32"/>
                 <w:rtl/>
               </w:rPr>
-              <w:t xml:space="preserve">اَلتَّاجِرُ الْأَمِينُ</w:t>
+              <w:t xml:space="preserve">اَلتَّاجِرُ الأَمِينُ</w:t>
             </w:r>
           </w:p>
           <w:p>
@@ -540,7 +540,7 @@
                 <w:szCs w:val="30"/>
                 <w:rtl/>
               </w:rPr>
-              <w:t xml:space="preserve">كَانَ فِي مَدِينَتِنَا تَاجِرٌ اسْمُهُ سَعِيدٌ، وَكَانَ مَعْرُوفًا بِالصِّدْقِ وَالْأَمَانَةِ.</w:t>
+              <w:t xml:space="preserve">كَانَ فِي مَدِينَتِنَا تَاجِرٌ اسْمُهُ سَعِيدٌ، وَكَانَ مَعْرُوفًا بِالصِّدْقِ وَالْأَمَانَةِ.</w:t>
             </w:r>
           </w:p>
           <w:p>
@@ -558,7 +558,7 @@
                 <w:szCs w:val="30"/>
                 <w:rtl/>
               </w:rPr>
-              <w:t xml:space="preserve">فِي أَحَدِ الْأَيَّامِ، جَاءَ إِلَى دُكَّانِهِ رَجُلٌ فَقِيرٌ وَاشْتَرَى مِنْهُ قَمِيصًا رَخِيصًا.</w:t>
+              <w:t xml:space="preserve">فِي أَحَدِ الأَيَّامِ، جَاءَ إِلَى دُكَّانِهِ رَجُلٌ فَقِيرٌ وَاشْتَرَى مِنْهُ قَمِيصًا رَخِيصًا.</w:t>
             </w:r>
           </w:p>
           <w:p>
@@ -576,7 +576,7 @@
                 <w:szCs w:val="30"/>
                 <w:rtl/>
               </w:rPr>
-              <w:t xml:space="preserve">وَبَعْدَ سَاعَةٍ، اِكْتَشَفَ سَعِيدٌ أَنَّ الرَّجُلَ نَسِيَ مَحْفَظَتَهُ عَلَى الطَّاوِلَةِ.</w:t>
+              <w:t xml:space="preserve">وَبَعْدَ سَاعَةٍ، اِكْتَشَفَ سَعِيدٌ أَنَّ الرَّجُلَ نَسِيَ مَحْفَظَتَهُ عَلَى الطَّاوِلَةِ.</w:t>
             </w:r>
           </w:p>
           <w:p>
@@ -594,7 +594,7 @@
                 <w:szCs w:val="30"/>
                 <w:rtl/>
               </w:rPr>
-              <w:t xml:space="preserve">فَتَحَ سَعِيدٌ الْمَحْفَظَةَ فَوَجَدَ فِيهَا نُقُودًا كَثِيرَةً وَبِطَاقَةً عَلَيْهَا عُنْوَانُ صَاحِبِهَا.</w:t>
+              <w:t xml:space="preserve">فَتَحَ سَعِيدٌ المَحْفَظَةَ فَوَجَدَ فِيهَا نُقُودًا كَثِيرَةً وَبِطَاقَةً عَلَيْهَا عُنْوَانُ صَاحِبِهَا.</w:t>
             </w:r>
           </w:p>
           <w:p>
@@ -612,7 +612,7 @@
                 <w:szCs w:val="30"/>
                 <w:rtl/>
               </w:rPr>
-              <w:t xml:space="preserve">أَغْلَقَ التَّاجِرُ دُكَّانَهُ وَذَهَبَ إِلَى ذَلِكَ الْعُنْوَانِ بِسَيَّارَتِهِ.</w:t>
+              <w:t xml:space="preserve">أَغْلَقَ التَّاجِرُ دُكَّانَهُ وَذَهَبَ إِلَى ذَلِكَ العُنْوَانِ بِسَيَّارَتِهِ.</w:t>
             </w:r>
           </w:p>
           <w:p>
@@ -630,7 +630,7 @@
                 <w:szCs w:val="30"/>
                 <w:rtl/>
               </w:rPr>
-              <w:t xml:space="preserve">وَلَمَّا وَصَلَ، وَجَدَ الرَّجُلَ حَزِينًا لِأَنَّهُ فَقَدَ مَالَ عِلَاجِ ابْنِهِ الْمَرِيضِ.</w:t>
+              <w:t xml:space="preserve">وَلَمَّا وَصَلَ، وَجَدَ الرَّجُلَ حَزِينًا لِأَنَّهُ فَقَدَ مَالَ عِلَاجِ ابْنِهِ المَرِيضِ.</w:t>
             </w:r>
           </w:p>
           <w:p>
@@ -648,7 +648,7 @@
                 <w:szCs w:val="30"/>
                 <w:rtl/>
               </w:rPr>
-              <w:t xml:space="preserve">أَعْطَاهُ سَعِيدٌ الْمَحْفَظَةَ وَقَالَ لَهُ: «هَذِهِ أَمَانَتُكَ، وَالْأَمَانَةُ وَاجِبَةٌ عَلَيْنَا.»</w:t>
+              <w:t xml:space="preserve">أَعْطَاهُ سَعِيدٌ المَحْفَظَةَ وَقَالَ لَهُ: «هَذِهِ أَمَانَتُكَ، وَالْأَمَانَةُ وَاجِبَةٌ عَلَيْنَا.»</w:t>
             </w:r>
           </w:p>
           <w:p>
@@ -666,7 +666,7 @@
                 <w:szCs w:val="30"/>
                 <w:rtl/>
               </w:rPr>
-              <w:t xml:space="preserve">شَكَرَهُ الرَّجُلُ كَثِيرًا وَدَعَا لَهُ بِالْخَيْرِ وَالْبَرَكَةِ.</w:t>
+              <w:t xml:space="preserve">شَكَرَهُ الرَّجُلُ كَثِيرًا وَدَعَا لَهُ بِالْخَيْرِ وَالْبَرَكَةِ.</w:t>
             </w:r>
           </w:p>
           <w:p>
@@ -684,7 +684,7 @@
                 <w:szCs w:val="30"/>
                 <w:rtl/>
               </w:rPr>
-              <w:t xml:space="preserve">وَفِي الْيَوْمِ التَّالِي، تَحَدَّثَ النَّاسُ عَنْ أَمَانَةِ سَعِيدٍ فِي كُلِّ مَكَانٍ.</w:t>
+              <w:t xml:space="preserve">وَفِي اليَوْمِ التَّالِي، تَحَدَّثَ النَّاسُ عَنْ أَمَانَةِ سَعِيدٍ فِي كُلِّ مَكَانٍ.</w:t>
             </w:r>
           </w:p>
           <w:p>
@@ -702,7 +702,7 @@
                 <w:szCs w:val="30"/>
                 <w:rtl/>
               </w:rPr>
-              <w:t xml:space="preserve">وَهَكَذَا صَارَ دُكَّانُهُ أَشْهَرَ دُكَّانٍ فِي الْمَدِينَةِ.</w:t>
+              <w:t xml:space="preserve">وَهَكَذَا صَارَ دُكَّانُهُ أَشْهَرَ دُكَّانٍ فِي المَدِينَةِ.</w:t>
             </w:r>
           </w:p>
           <w:p>
@@ -720,7 +720,7 @@
                 <w:szCs w:val="30"/>
                 <w:rtl/>
               </w:rPr>
-              <w:t xml:space="preserve">إِنَّ الصَّادِقَ الْأَمِينَ لَا يَخْسَرُ أَبَدًا.</w:t>
+              <w:t xml:space="preserve">إِنَّ الصَّادِقَ الأَمِينَ لَا يَخْسَرُ أَبَدًا.</w:t>
             </w:r>
           </w:p>
         </w:tc>
@@ -774,7 +774,7 @@
           <w:szCs w:val="28"/>
           <w:rtl/>
         </w:rPr>
-        <w:t xml:space="preserve">لِمَاذَا كَانَ الرَّجُلُ حَزِينًا؟</w:t>
+        <w:t xml:space="preserve">لِمَاذَا كَانَ الرَّجُلُ حَزِينًا؟</w:t>
       </w:r>
     </w:p>
     <w:tbl>
@@ -842,7 +842,7 @@
                 <w:szCs w:val="28"/>
                 <w:rtl/>
               </w:rPr>
-              <w:t xml:space="preserve">لِأَنَّهُ لَمْ يَجِدْ قَمِيصًا</w:t>
+              <w:t xml:space="preserve">لِأَنَّهُ لَمْ يَجِدْ قَمِيصًا</w:t>
             </w:r>
           </w:p>
         </w:tc>
@@ -891,7 +891,7 @@
                 <w:szCs w:val="28"/>
                 <w:rtl/>
               </w:rPr>
-              <w:t xml:space="preserve">لِأَنَّهُ فَقَدَ مَالَ عِلَاجِ ابْنِهِ</w:t>
+              <w:t xml:space="preserve">لِأَنَّهُ فَقَدَ مَالَ عِلَاجِ ابْنِهِ</w:t>
             </w:r>
           </w:p>
         </w:tc>
@@ -945,7 +945,7 @@
                 <w:szCs w:val="28"/>
                 <w:rtl/>
               </w:rPr>
-              <w:t xml:space="preserve">لِأَنَّهُ نَسِيَ عُنْوَانَ بَيْتِهِ</w:t>
+              <w:t xml:space="preserve">لِأَنَّهُ نَسِيَ عُنْوَانَ بَيْتِهِ</w:t>
             </w:r>
           </w:p>
         </w:tc>
@@ -994,7 +994,7 @@
                 <w:szCs w:val="28"/>
                 <w:rtl/>
               </w:rPr>
-              <w:t xml:space="preserve">لِأَنَّ دُكَّانَ سَعِيدٍ أُغْلِقَ</w:t>
+              <w:t xml:space="preserve">لِأَنَّ دُكَّانَ سَعِيدٍ أُغْلِقَ</w:t>
             </w:r>
           </w:p>
         </w:tc>
@@ -1030,7 +1030,7 @@
           <w:szCs w:val="28"/>
           <w:rtl/>
         </w:rPr>
-        <w:t xml:space="preserve">مَا الْفِكْرَةُ الرَّئِيسَةُ لِلنَّصِّ؟</w:t>
+        <w:t xml:space="preserve">مَا الفِكْرَةُ الرَّئِيسَةُ لِلنَّصِّ؟</w:t>
       </w:r>
     </w:p>
     <w:tbl>
@@ -1098,7 +1098,7 @@
                 <w:szCs w:val="28"/>
                 <w:rtl/>
               </w:rPr>
-              <w:t xml:space="preserve">أَنَّ الْأَمَانَةَ تَرْفَعُ صَاحِبَهَا</w:t>
+              <w:t xml:space="preserve">أَنَّ الأَمَانَةَ تَرْفَعُ صَاحِبَهَا</w:t>
             </w:r>
           </w:p>
         </w:tc>
@@ -1147,7 +1147,7 @@
                 <w:szCs w:val="28"/>
                 <w:rtl/>
               </w:rPr>
-              <w:t xml:space="preserve">أَهَمِّيَّةُ التِّجَارَةِ فِي الْمَدِينَةِ</w:t>
+              <w:t xml:space="preserve">أَهَمِّيَّةُ التِّجَارَةِ فِي المَدِينَةِ</w:t>
             </w:r>
           </w:p>
         </w:tc>
@@ -1201,7 +1201,7 @@
                 <w:szCs w:val="28"/>
                 <w:rtl/>
               </w:rPr>
-              <w:t xml:space="preserve">وَصْفُ دُكَّانٍ قَدِيمٍ فِي السُّوقِ</w:t>
+              <w:t xml:space="preserve">وَصْفُ دُكَّانٍ قَدِيمٍ فِي السُّوقِ</w:t>
             </w:r>
           </w:p>
         </w:tc>
@@ -1250,7 +1250,7 @@
                 <w:szCs w:val="28"/>
                 <w:rtl/>
               </w:rPr>
-              <w:t xml:space="preserve">أَنَّ الْفَقْرَ سَبَبُ الْحُزْنِ</w:t>
+              <w:t xml:space="preserve">أَنَّ الفَقْرَ سَبَبُ الحُزْنِ</w:t>
             </w:r>
           </w:p>
         </w:tc>
@@ -1286,7 +1286,7 @@
           <w:szCs w:val="28"/>
           <w:rtl/>
         </w:rPr>
-        <w:t xml:space="preserve">مَاذَا نَفْهَمُ مِنْ جُمْلَةِ «صَارَ دُكَّانُهُ أَشْهَرَ دُكَّانٍ فِي الْمَدِينَةِ»؟</w:t>
+        <w:t xml:space="preserve">مَاذَا نَفْهَمُ مِنْ جُمْلَةِ «صَارَ دُكَّانُهُ أَشْهَرَ دُكَّانٍ فِي المَدِينَةِ»؟</w:t>
       </w:r>
     </w:p>
     <w:tbl>
@@ -1354,7 +1354,7 @@
                 <w:szCs w:val="28"/>
                 <w:rtl/>
               </w:rPr>
-              <w:t xml:space="preserve">أَنَّ الدُّكَّانَ كَبِيرٌ جِدًّا</w:t>
+              <w:t xml:space="preserve">أَنَّ الدُّكَّانَ كَبِيرٌ جِدًّا</w:t>
             </w:r>
           </w:p>
         </w:tc>
@@ -1403,7 +1403,7 @@
                 <w:szCs w:val="28"/>
                 <w:rtl/>
               </w:rPr>
-              <w:t xml:space="preserve">أَنَّ النَّاسَ وَثِقُوا بِهِ فَقَصَدُوهُ</w:t>
+              <w:t xml:space="preserve">أَنَّ النَّاسَ وَثِقُوا بِهِ فَقَصَدُوهُ</w:t>
             </w:r>
           </w:p>
         </w:tc>
@@ -1457,7 +1457,7 @@
                 <w:szCs w:val="28"/>
                 <w:rtl/>
               </w:rPr>
-              <w:t xml:space="preserve">أَنَّهُ انْتَقَلَ إِلَى مَدِينَةٍ أُخْرَى</w:t>
+              <w:t xml:space="preserve">أَنَّهُ انْتَقَلَ إِلَى مَدِينَةٍ أُخْرَى</w:t>
             </w:r>
           </w:p>
         </w:tc>
@@ -1506,7 +1506,7 @@
                 <w:szCs w:val="28"/>
                 <w:rtl/>
               </w:rPr>
-              <w:t xml:space="preserve">أَنَّهُ بَاعَ الْقُمْصَانَ الرَّخِيصَةَ</w:t>
+              <w:t xml:space="preserve">أَنَّهُ بَاعَ القُمْصَانَ الرَّخِيصَةَ</w:t>
             </w:r>
           </w:p>
         </w:tc>
@@ -1897,7 +1897,7 @@
                 <w:szCs w:val="28"/>
                 <w:rtl/>
               </w:rPr>
-              <w:t xml:space="preserve">نَظَّفَ الطُّلَّابُ حَدِيقَةَ الْمَدْرَسَةِ.</w:t>
+              <w:t xml:space="preserve">نَظَّفَ الطُّلَّابُ حَدِيقَةَ المَدْرَسَةِ.</w:t>
             </w:r>
           </w:p>
         </w:tc>
@@ -2023,7 +2023,7 @@
                 <w:szCs w:val="28"/>
                 <w:rtl/>
               </w:rPr>
-              <w:t xml:space="preserve">بَدَأَ الْعَمَلُ فِي السَّاعَةِ الْعَاشِرَةِ.</w:t>
+              <w:t xml:space="preserve">بَدَأَ العَمَلُ فِي السَّاعَةِ العَاشِرَةِ.</w:t>
             </w:r>
           </w:p>
         </w:tc>
@@ -2149,7 +2149,7 @@
                 <w:szCs w:val="28"/>
                 <w:rtl/>
               </w:rPr>
-              <w:t xml:space="preserve">زَرَعَ الْأَوْلَادُ الْأَشْجَارَ.</w:t>
+              <w:t xml:space="preserve">زَرَعَ الأَوْلَادُ الأَشْجَارَ.</w:t>
             </w:r>
           </w:p>
         </w:tc>
@@ -2275,7 +2275,7 @@
                 <w:szCs w:val="28"/>
                 <w:rtl/>
               </w:rPr>
-              <w:t xml:space="preserve">لَمْ يُسَاعِدْهُمْ مُدِيرُ الْمَدْرَسَةِ.</w:t>
+              <w:t xml:space="preserve">لَمْ يُسَاعِدْهُمْ مُدِيرُ المَدْرَسَةِ.</w:t>
             </w:r>
           </w:p>
         </w:tc>
@@ -2401,7 +2401,7 @@
                 <w:szCs w:val="28"/>
                 <w:rtl/>
               </w:rPr>
-              <w:t xml:space="preserve">قَالَ الْمُعَلِّمُ إِنَّ التَّعَاوُنَ قُوَّةٌ.</w:t>
+              <w:t xml:space="preserve">قَالَ المُعَلِّمُ إِنَّ التَّعَاوُنَ قُوَّةٌ.</w:t>
             </w:r>
           </w:p>
         </w:tc>
@@ -2637,7 +2637,7 @@
                 <w:szCs w:val="28"/>
                 <w:rtl/>
               </w:rPr>
-              <w:t xml:space="preserve">مَعَ السَّلَامَةِ يَا جَارِي</w:t>
+              <w:t xml:space="preserve">مَعَ السَّلَامَةِ يَا جَارِي</w:t>
             </w:r>
           </w:p>
         </w:tc>
@@ -2687,7 +2687,7 @@
                 <w:szCs w:val="28"/>
                 <w:rtl/>
               </w:rPr>
-              <w:t xml:space="preserve">أَيْنَ ذَهَبْتَ أَمْسِ</w:t>
+              <w:t xml:space="preserve">أَيْن ذَهَبْتَ أَمْسِ</w:t>
             </w:r>
           </w:p>
         </w:tc>
@@ -2742,7 +2742,7 @@
                 <w:szCs w:val="28"/>
                 <w:rtl/>
               </w:rPr>
-              <w:t xml:space="preserve">شَفَاكَ اللَّهُ وَعَافَاكَ</w:t>
+              <w:t xml:space="preserve">شَفَاكَ اللَّهُ وَعَافَاكَ</w:t>
             </w:r>
           </w:p>
         </w:tc>
@@ -2884,7 +2884,7 @@
                 <w:szCs w:val="28"/>
                 <w:rtl/>
               </w:rPr>
-              <w:t xml:space="preserve">لَا أَعْرِفُ هَذَا الْكِتَابَ</w:t>
+              <w:t xml:space="preserve">لَا أَعْرِفُ هَذَا الكِتَابَ</w:t>
             </w:r>
           </w:p>
         </w:tc>
@@ -2934,7 +2934,7 @@
                 <w:szCs w:val="28"/>
                 <w:rtl/>
               </w:rPr>
-              <w:t xml:space="preserve">تَفَضَّلْ، هَذِهِ أَمَانَتُكَ</w:t>
+              <w:t xml:space="preserve">تَفَضَّلْ، هَذِهِ أَمَانَتُكَ</w:t>
             </w:r>
           </w:p>
         </w:tc>
@@ -3039,7 +3039,7 @@
                 <w:szCs w:val="28"/>
                 <w:rtl/>
               </w:rPr>
-              <w:t xml:space="preserve">سَوْفَ أَبِيعُ الْكِتَابَ</w:t>
+              <w:t xml:space="preserve">سَوْفَ أَبِيعُ الكِتَابَ</w:t>
             </w:r>
           </w:p>
         </w:tc>
@@ -3131,7 +3131,7 @@
                 <w:szCs w:val="28"/>
                 <w:rtl/>
               </w:rPr>
-              <w:t xml:space="preserve">أَخَذَ النُّقُودَ لِنَفْسِهِ</w:t>
+              <w:t xml:space="preserve">أَخَذَ النُّقُودَ لِنَفْسِهِ</w:t>
             </w:r>
           </w:p>
         </w:tc>
@@ -3181,7 +3181,7 @@
                 <w:szCs w:val="28"/>
                 <w:rtl/>
               </w:rPr>
-              <w:t xml:space="preserve">اِتَّصَلَ بِالشُّرْطَةِ</w:t>
+              <w:t xml:space="preserve">اِتَّصَلَ بِالشُّرْطَةِ</w:t>
             </w:r>
           </w:p>
         </w:tc>
@@ -3236,7 +3236,7 @@
                 <w:szCs w:val="28"/>
                 <w:rtl/>
               </w:rPr>
-              <w:t xml:space="preserve">بَاعَ الْمَحْفَظَةَ فِي السُّوقِ</w:t>
+              <w:t xml:space="preserve">بَاعَ المَحْفَظَةَ فِي السُّوقِ</w:t>
             </w:r>
           </w:p>
         </w:tc>
@@ -3286,7 +3286,7 @@
                 <w:szCs w:val="28"/>
                 <w:rtl/>
               </w:rPr>
-              <w:t xml:space="preserve">أَغْلَقَ دُكَّانَهُ وَذَهَبَ إِلَى الْعُنْوَانِ</w:t>
+              <w:t xml:space="preserve">أَغْلَقَ دُكَّانَهُ وَذَهَبَ إِلَى العُنْوَانِ</w:t>
             </w:r>
           </w:p>
         </w:tc>
@@ -3378,7 +3378,7 @@
                 <w:szCs w:val="28"/>
                 <w:rtl/>
               </w:rPr>
-              <w:t xml:space="preserve">لَا تَكْذِبْ يَا أَخِي الصَّغِيرَ</w:t>
+              <w:t xml:space="preserve">لَا تَكْذِبْ يَا أَخِي الصَّغِيرَ</w:t>
             </w:r>
           </w:p>
         </w:tc>
@@ -3556,7 +3556,7 @@
           <w:sz w:val="20"/>
           <w:szCs w:val="20"/>
         </w:rPr>
-        <w:t xml:space="preserve">5.  «اَلصَّادِقُ الْأَمِينُ لَا يَخْسَرُ أَبَدًا» cümlesinden çıkarılabilecek sonuç hangisidir?</w:t>
+        <w:t xml:space="preserve">5.  «اَلصَّادِقُ الأَمِينُ لَا يَخْسَرُ أَبَدًا» cümlesinden çıkarılabilecek sonuç hangisidir?</w:t>
       </w:r>
     </w:p>
     <w:tbl>
@@ -4050,7 +4050,7 @@
                 <w:szCs w:val="26"/>
                 <w:rtl/>
               </w:rPr>
-              <w:t xml:space="preserve">اِصْبِرْ، فَإِنَّ الصَّبْرَ مِفْتَاحُ الْفَرَجِ</w:t>
+              <w:t xml:space="preserve">اِصْبِرْ، فَإِنَّ الصَّبْرَ مِفْتَاحُ الفَرَجِ</w:t>
             </w:r>
           </w:p>
         </w:tc>
@@ -4220,7 +4220,7 @@
                 <w:szCs w:val="26"/>
                 <w:rtl/>
               </w:rPr>
-              <w:t xml:space="preserve">جَزَاكَ اللَّهُ خَيْرًا عَلَى مُسَاعَدَتِكَ</w:t>
+              <w:t xml:space="preserve">جَزَاكَ اللَّهُ خَيْرًا عَلَى مُسَاعَدَتِكَ</w:t>
             </w:r>
           </w:p>
         </w:tc>
@@ -4560,7 +4560,7 @@
                 <w:szCs w:val="26"/>
                 <w:rtl/>
               </w:rPr>
-              <w:t xml:space="preserve">لَا تُلْقِ النُّفَايَاتِ فِي الشَّارِعِ</w:t>
+              <w:t xml:space="preserve">لَا تُلْقِ النُّفَايَاتِ فِي الشَّارِعِ</w:t>
             </w:r>
           </w:p>
         </w:tc>
@@ -4730,7 +4730,7 @@
                 <w:szCs w:val="26"/>
                 <w:rtl/>
               </w:rPr>
-              <w:t xml:space="preserve">صِلَةُ الرَّحِمِ تَزِيدُ فِي الْعُمُرِ</w:t>
+              <w:t xml:space="preserve">صِلَةُ الرَّحِمِ تَزِيدُ فِي العُمُرِ</w:t>
             </w:r>
           </w:p>
         </w:tc>
@@ -4882,7 +4882,7 @@
                 <w:szCs w:val="30"/>
                 <w:rtl/>
               </w:rPr>
-              <w:t xml:space="preserve">الْأَمَانَةِ   —   مَحْفَظَتَهُ   —   الْعُنْوَانِ   —   حَزِينًا   —   أَشْهَرَ</w:t>
+              <w:t xml:space="preserve">الأَمَانَةِ   —   مَحْفَظَتَهُ   —   العُنْوَانِ   —   حَزِينًا   —   أَشْهَرَ</w:t>
             </w:r>
           </w:p>
         </w:tc>
@@ -4989,7 +4989,7 @@
                 <w:szCs w:val="28"/>
                 <w:rtl/>
               </w:rPr>
-              <w:t xml:space="preserve">كَانَ سَعِيدٌ مَعْرُوفًا بِالصِّدْقِ وَ……………………… .</w:t>
+              <w:t xml:space="preserve">كَانَ سَعِيدٌ مَعْرُوفًا بِالصِّدْقِ وَ……………………… .</w:t>
             </w:r>
           </w:p>
         </w:tc>
@@ -5061,7 +5061,7 @@
                 <w:szCs w:val="28"/>
                 <w:rtl/>
               </w:rPr>
-              <w:t xml:space="preserve">نَسِيَ الرَّجُلُ ……………………… عَلَى الطَّاوِلَةِ.</w:t>
+              <w:t xml:space="preserve">نَسِيَ الرَّجُلُ ……………………… عَلَى الطَّاوِلَةِ.</w:t>
             </w:r>
           </w:p>
         </w:tc>
@@ -5133,7 +5133,7 @@
                 <w:szCs w:val="28"/>
                 <w:rtl/>
               </w:rPr>
-              <w:t xml:space="preserve">ذَهَبَ التَّاجِرُ إِلَى ذَلِكَ ……………………… بِسَيَّارَتِهِ.</w:t>
+              <w:t xml:space="preserve">ذَهَبَ التَّاجِرُ إِلَى ذَلِكَ ……………………… بِسَيَّارَتِهِ.</w:t>
             </w:r>
           </w:p>
         </w:tc>
@@ -5205,7 +5205,7 @@
                 <w:szCs w:val="28"/>
                 <w:rtl/>
               </w:rPr>
-              <w:t xml:space="preserve">وَجَدَ سَعِيدٌ الرَّجُلَ ……………………… فِي بَيْتِهِ.</w:t>
+              <w:t xml:space="preserve">وَجَدَ سَعِيدٌ الرَّجُلَ ……………………… فِي بَيْتِهِ.</w:t>
             </w:r>
           </w:p>
         </w:tc>
@@ -5277,7 +5277,7 @@
                 <w:szCs w:val="28"/>
                 <w:rtl/>
               </w:rPr>
-              <w:t xml:space="preserve">صَارَ دُكَّانُهُ ……………………… دُكَّانٍ فِي الْمَدِينَةِ.</w:t>
+              <w:t xml:space="preserve">صَارَ دُكَّانُهُ ……………………… دُكَّانٍ فِي المَدِينَةِ.</w:t>
             </w:r>
           </w:p>
         </w:tc>
@@ -6800,7 +6800,7 @@
                 <w:szCs w:val="30"/>
                 <w:rtl/>
               </w:rPr>
-              <w:t xml:space="preserve">فِي أَحَدِ الْأَيَّامِ   —   سَاعَدَ   —   شَكَرَ   —   اَلتَّعَاوُنُ   —   اَلْأَمَانَةُ   —   وَفِي النِّهَايَةِ   —   تَعَلَّمْتُ أَنَّ</w:t>
+              <w:t xml:space="preserve">فِي أَحَدِ الأَيَّامِ   —   سَاعَدَ   —   شَكَرَ   —   اَلتَّعَاوُنُ   —   اَلأَمَانَةُ   —   وَفِي النِّهَايَةِ   —   تَعَلَّمْتُ أَنَّ</w:t>
             </w:r>
           </w:p>
         </w:tc>
@@ -7350,7 +7350,7 @@
                 <w:sz w:val="19"/>
                 <w:szCs w:val="19"/>
               </w:rPr>
-              <w:t xml:space="preserve">d) Örnek: اَلْأَمَانَةُ خُلُقٌ عَظِيمٌ يَرْفَعُ صَاحِبَهُ (3 puan)</w:t>
+              <w:t xml:space="preserve">d) Örnek: اَلأَمَانَةُ خُلُقٌ عَظِيمٌ يَرْفَعُ صَاحِبَهُ (3 puan)</w:t>
             </w:r>
           </w:p>
         </w:tc>
@@ -7462,7 +7462,7 @@
                 <w:sz w:val="19"/>
                 <w:szCs w:val="19"/>
               </w:rPr>
-              <w:t xml:space="preserve">اَلْأُسْبُوعَ الْمَاضِيَ نَظَّفَ طُلَّابُ صَفِّنَا حَدِيقَةَ الْمَدْرَسَةِ. بَدَأْنَا فِي السَّاعَةِ التَّاسِعَةِ صَبَاحًا. زَرَعَ الْأَوْلَادُ الْأَشْجَارَ وَجَمَعَتِ الْبَنَاتُ الْأَوْرَاقَ. وَسَاعَدَنَا الْمُدِيرُ أَيْضًا. وَفِي النِّهَايَةِ شَكَرَنَا الْمُعَلِّمُ وَقَالَ: إِنَّ التَّعَاوُنَ قُوَّةٌ.</w:t>
+              <w:t xml:space="preserve">اَلأُسْبُوعَ المَاضِيَ نَظَّفَ طُلَّابُ صَفِّنَا حَدِيقَةَ المَدْرَسَةِ. بَدَأْنَا فِي السَّاعَةِ التَّاسِعَةِ صَبَاحًا. زَرَعَ الأَوْلَادُ الأَشْجَارَ وَجَمَعَتِ البَنَاتُ الأَوْرَاقَ. وَسَاعَدَنَا المُدِيرُ أَيْضًا. وَفِي النِّهَايَةِ شَكَرَنَا المُعَلِّمُ وَقَالَ: إِنَّ التَّعَاوُنَ قُوَّةٌ.</w:t>
             </w:r>
           </w:p>
           <w:p>
@@ -7762,7 +7762,7 @@
                 <w:szCs w:val="27"/>
                 <w:rtl/>
               </w:rPr>
-              <w:t xml:space="preserve">الْأَمَانَةِ ، مَحْفَظَتَهُ ، الْعُنْوَانِ ، حَزِينًا ، أَشْهَرَ</w:t>
+              <w:t xml:space="preserve">الأَمَانَةِ ، مَحْفَظَتَهُ ، العُنْوَانِ ، حَزِينًا ، أَشْهَرَ</w:t>
             </w:r>
           </w:p>
         </w:tc>
@@ -7950,7 +7950,7 @@
                 <w:szCs w:val="27"/>
                 <w:rtl/>
               </w:rPr>
-              <w:t xml:space="preserve">كَانَ مَعْرُوفًا بِالصِّدْقِ وَالْأَمَانَةِ. · اِشْتَرَى قَمِيصًا رَخِيصًا.</w:t>
+              <w:t xml:space="preserve">كَانَ مَعْرُوفًا بِالصِّدْقِ وَالْأَمَانَةِ. · اِشْتَرَى قَمِيصًا رَخِيصًا.</w:t>
             </w:r>
           </w:p>
           <w:p>
@@ -7968,7 +7968,7 @@
                 <w:szCs w:val="27"/>
                 <w:rtl/>
               </w:rPr>
-              <w:t xml:space="preserve">وَجَدَ نُقُودًا وَبِطَاقَةً. · قَالَ: هَذِهِ أَمَانَتُكَ. · صَارَ أَشْهَرَ دُكَّانٍ.</w:t>
+              <w:t xml:space="preserve">وَجَدَ نُقُودًا وَبِطَاقَةً. · قَالَ: هَذِهِ أَمَانَتُكَ. · صَارَ أَشْهَرَ دُكَّانٍ.</w:t>
             </w:r>
           </w:p>
         </w:tc>

</xml_diff>

<commit_message>
28.09.2026 — Sınav Oluştur kutusundaki başlık ve alt açıklama siyaha alındı.
</commit_message>
<xml_diff>
--- a/dosyalar/10-sinif/arapca-10-1d1y-beceri.docx
+++ b/dosyalar/10-sinif/arapca-10-1d1y-beceri.docx
@@ -514,7 +514,7 @@
             </w:pPr>
             <w:r>
               <w:rPr>
-                <w:rFonts w:ascii="Markazi Text" w:cs="Markazi Text" w:eastAsia="Markazi Text" w:hAnsi="Markazi Text"/>
+                <w:rFonts w:ascii="Arakom" w:cs="Arakom" w:eastAsia="Arakom" w:hAnsi="Arakom"/>
                 <w:b/>
                 <w:bCs/>
                 <w:color w:val="111111"/>
@@ -532,7 +532,7 @@
             </w:pPr>
             <w:r>
               <w:rPr>
-                <w:rFonts w:ascii="Markazi Text" w:cs="Markazi Text" w:eastAsia="Markazi Text" w:hAnsi="Markazi Text"/>
+                <w:rFonts w:ascii="Arakom" w:cs="Arakom" w:eastAsia="Arakom" w:hAnsi="Arakom"/>
                 <w:b w:val="false"/>
                 <w:bCs w:val="false"/>
                 <w:color w:val="111111"/>
@@ -550,7 +550,7 @@
             </w:pPr>
             <w:r>
               <w:rPr>
-                <w:rFonts w:ascii="Markazi Text" w:cs="Markazi Text" w:eastAsia="Markazi Text" w:hAnsi="Markazi Text"/>
+                <w:rFonts w:ascii="Arakom" w:cs="Arakom" w:eastAsia="Arakom" w:hAnsi="Arakom"/>
                 <w:b w:val="false"/>
                 <w:bCs w:val="false"/>
                 <w:color w:val="111111"/>
@@ -568,7 +568,7 @@
             </w:pPr>
             <w:r>
               <w:rPr>
-                <w:rFonts w:ascii="Markazi Text" w:cs="Markazi Text" w:eastAsia="Markazi Text" w:hAnsi="Markazi Text"/>
+                <w:rFonts w:ascii="Arakom" w:cs="Arakom" w:eastAsia="Arakom" w:hAnsi="Arakom"/>
                 <w:b w:val="false"/>
                 <w:bCs w:val="false"/>
                 <w:color w:val="111111"/>
@@ -586,7 +586,7 @@
             </w:pPr>
             <w:r>
               <w:rPr>
-                <w:rFonts w:ascii="Markazi Text" w:cs="Markazi Text" w:eastAsia="Markazi Text" w:hAnsi="Markazi Text"/>
+                <w:rFonts w:ascii="Arakom" w:cs="Arakom" w:eastAsia="Arakom" w:hAnsi="Arakom"/>
                 <w:b w:val="false"/>
                 <w:bCs w:val="false"/>
                 <w:color w:val="111111"/>
@@ -604,7 +604,7 @@
             </w:pPr>
             <w:r>
               <w:rPr>
-                <w:rFonts w:ascii="Markazi Text" w:cs="Markazi Text" w:eastAsia="Markazi Text" w:hAnsi="Markazi Text"/>
+                <w:rFonts w:ascii="Arakom" w:cs="Arakom" w:eastAsia="Arakom" w:hAnsi="Arakom"/>
                 <w:b w:val="false"/>
                 <w:bCs w:val="false"/>
                 <w:color w:val="111111"/>
@@ -622,7 +622,7 @@
             </w:pPr>
             <w:r>
               <w:rPr>
-                <w:rFonts w:ascii="Markazi Text" w:cs="Markazi Text" w:eastAsia="Markazi Text" w:hAnsi="Markazi Text"/>
+                <w:rFonts w:ascii="Arakom" w:cs="Arakom" w:eastAsia="Arakom" w:hAnsi="Arakom"/>
                 <w:b w:val="false"/>
                 <w:bCs w:val="false"/>
                 <w:color w:val="111111"/>
@@ -640,7 +640,7 @@
             </w:pPr>
             <w:r>
               <w:rPr>
-                <w:rFonts w:ascii="Markazi Text" w:cs="Markazi Text" w:eastAsia="Markazi Text" w:hAnsi="Markazi Text"/>
+                <w:rFonts w:ascii="Arakom" w:cs="Arakom" w:eastAsia="Arakom" w:hAnsi="Arakom"/>
                 <w:b w:val="false"/>
                 <w:bCs w:val="false"/>
                 <w:color w:val="111111"/>
@@ -658,7 +658,7 @@
             </w:pPr>
             <w:r>
               <w:rPr>
-                <w:rFonts w:ascii="Markazi Text" w:cs="Markazi Text" w:eastAsia="Markazi Text" w:hAnsi="Markazi Text"/>
+                <w:rFonts w:ascii="Arakom" w:cs="Arakom" w:eastAsia="Arakom" w:hAnsi="Arakom"/>
                 <w:b w:val="false"/>
                 <w:bCs w:val="false"/>
                 <w:color w:val="111111"/>
@@ -676,7 +676,7 @@
             </w:pPr>
             <w:r>
               <w:rPr>
-                <w:rFonts w:ascii="Markazi Text" w:cs="Markazi Text" w:eastAsia="Markazi Text" w:hAnsi="Markazi Text"/>
+                <w:rFonts w:ascii="Arakom" w:cs="Arakom" w:eastAsia="Arakom" w:hAnsi="Arakom"/>
                 <w:b w:val="false"/>
                 <w:bCs w:val="false"/>
                 <w:color w:val="111111"/>
@@ -694,7 +694,7 @@
             </w:pPr>
             <w:r>
               <w:rPr>
-                <w:rFonts w:ascii="Markazi Text" w:cs="Markazi Text" w:eastAsia="Markazi Text" w:hAnsi="Markazi Text"/>
+                <w:rFonts w:ascii="Arakom" w:cs="Arakom" w:eastAsia="Arakom" w:hAnsi="Arakom"/>
                 <w:b w:val="false"/>
                 <w:bCs w:val="false"/>
                 <w:color w:val="111111"/>
@@ -712,7 +712,7 @@
             </w:pPr>
             <w:r>
               <w:rPr>
-                <w:rFonts w:ascii="Markazi Text" w:cs="Markazi Text" w:eastAsia="Markazi Text" w:hAnsi="Markazi Text"/>
+                <w:rFonts w:ascii="Arakom" w:cs="Arakom" w:eastAsia="Arakom" w:hAnsi="Arakom"/>
                 <w:b w:val="false"/>
                 <w:bCs w:val="false"/>
                 <w:color w:val="111111"/>
@@ -766,7 +766,7 @@
       </w:r>
       <w:r>
         <w:rPr>
-          <w:rFonts w:ascii="Markazi Text" w:cs="Markazi Text" w:eastAsia="Markazi Text" w:hAnsi="Markazi Text"/>
+          <w:rFonts w:ascii="Arakom" w:cs="Arakom" w:eastAsia="Arakom" w:hAnsi="Arakom"/>
           <w:b w:val="false"/>
           <w:bCs w:val="false"/>
           <w:color w:val="111111"/>
@@ -834,7 +834,7 @@
             </w:r>
             <w:r>
               <w:rPr>
-                <w:rFonts w:ascii="Markazi Text" w:cs="Markazi Text" w:eastAsia="Markazi Text" w:hAnsi="Markazi Text"/>
+                <w:rFonts w:ascii="Arakom" w:cs="Arakom" w:eastAsia="Arakom" w:hAnsi="Arakom"/>
                 <w:b w:val="false"/>
                 <w:bCs w:val="false"/>
                 <w:color w:val="111111"/>
@@ -883,7 +883,7 @@
             </w:r>
             <w:r>
               <w:rPr>
-                <w:rFonts w:ascii="Markazi Text" w:cs="Markazi Text" w:eastAsia="Markazi Text" w:hAnsi="Markazi Text"/>
+                <w:rFonts w:ascii="Arakom" w:cs="Arakom" w:eastAsia="Arakom" w:hAnsi="Arakom"/>
                 <w:b w:val="false"/>
                 <w:bCs w:val="false"/>
                 <w:color w:val="111111"/>
@@ -937,7 +937,7 @@
             </w:r>
             <w:r>
               <w:rPr>
-                <w:rFonts w:ascii="Markazi Text" w:cs="Markazi Text" w:eastAsia="Markazi Text" w:hAnsi="Markazi Text"/>
+                <w:rFonts w:ascii="Arakom" w:cs="Arakom" w:eastAsia="Arakom" w:hAnsi="Arakom"/>
                 <w:b w:val="false"/>
                 <w:bCs w:val="false"/>
                 <w:color w:val="111111"/>
@@ -986,7 +986,7 @@
             </w:r>
             <w:r>
               <w:rPr>
-                <w:rFonts w:ascii="Markazi Text" w:cs="Markazi Text" w:eastAsia="Markazi Text" w:hAnsi="Markazi Text"/>
+                <w:rFonts w:ascii="Arakom" w:cs="Arakom" w:eastAsia="Arakom" w:hAnsi="Arakom"/>
                 <w:b w:val="false"/>
                 <w:bCs w:val="false"/>
                 <w:color w:val="111111"/>
@@ -1022,7 +1022,7 @@
       </w:r>
       <w:r>
         <w:rPr>
-          <w:rFonts w:ascii="Markazi Text" w:cs="Markazi Text" w:eastAsia="Markazi Text" w:hAnsi="Markazi Text"/>
+          <w:rFonts w:ascii="Arakom" w:cs="Arakom" w:eastAsia="Arakom" w:hAnsi="Arakom"/>
           <w:b w:val="false"/>
           <w:bCs w:val="false"/>
           <w:color w:val="111111"/>
@@ -1090,7 +1090,7 @@
             </w:r>
             <w:r>
               <w:rPr>
-                <w:rFonts w:ascii="Markazi Text" w:cs="Markazi Text" w:eastAsia="Markazi Text" w:hAnsi="Markazi Text"/>
+                <w:rFonts w:ascii="Arakom" w:cs="Arakom" w:eastAsia="Arakom" w:hAnsi="Arakom"/>
                 <w:b w:val="false"/>
                 <w:bCs w:val="false"/>
                 <w:color w:val="111111"/>
@@ -1139,7 +1139,7 @@
             </w:r>
             <w:r>
               <w:rPr>
-                <w:rFonts w:ascii="Markazi Text" w:cs="Markazi Text" w:eastAsia="Markazi Text" w:hAnsi="Markazi Text"/>
+                <w:rFonts w:ascii="Arakom" w:cs="Arakom" w:eastAsia="Arakom" w:hAnsi="Arakom"/>
                 <w:b w:val="false"/>
                 <w:bCs w:val="false"/>
                 <w:color w:val="111111"/>
@@ -1193,7 +1193,7 @@
             </w:r>
             <w:r>
               <w:rPr>
-                <w:rFonts w:ascii="Markazi Text" w:cs="Markazi Text" w:eastAsia="Markazi Text" w:hAnsi="Markazi Text"/>
+                <w:rFonts w:ascii="Arakom" w:cs="Arakom" w:eastAsia="Arakom" w:hAnsi="Arakom"/>
                 <w:b w:val="false"/>
                 <w:bCs w:val="false"/>
                 <w:color w:val="111111"/>
@@ -1242,7 +1242,7 @@
             </w:r>
             <w:r>
               <w:rPr>
-                <w:rFonts w:ascii="Markazi Text" w:cs="Markazi Text" w:eastAsia="Markazi Text" w:hAnsi="Markazi Text"/>
+                <w:rFonts w:ascii="Arakom" w:cs="Arakom" w:eastAsia="Arakom" w:hAnsi="Arakom"/>
                 <w:b w:val="false"/>
                 <w:bCs w:val="false"/>
                 <w:color w:val="111111"/>
@@ -1278,7 +1278,7 @@
       </w:r>
       <w:r>
         <w:rPr>
-          <w:rFonts w:ascii="Markazi Text" w:cs="Markazi Text" w:eastAsia="Markazi Text" w:hAnsi="Markazi Text"/>
+          <w:rFonts w:ascii="Arakom" w:cs="Arakom" w:eastAsia="Arakom" w:hAnsi="Arakom"/>
           <w:b w:val="false"/>
           <w:bCs w:val="false"/>
           <w:color w:val="111111"/>
@@ -1346,7 +1346,7 @@
             </w:r>
             <w:r>
               <w:rPr>
-                <w:rFonts w:ascii="Markazi Text" w:cs="Markazi Text" w:eastAsia="Markazi Text" w:hAnsi="Markazi Text"/>
+                <w:rFonts w:ascii="Arakom" w:cs="Arakom" w:eastAsia="Arakom" w:hAnsi="Arakom"/>
                 <w:b w:val="false"/>
                 <w:bCs w:val="false"/>
                 <w:color w:val="111111"/>
@@ -1395,7 +1395,7 @@
             </w:r>
             <w:r>
               <w:rPr>
-                <w:rFonts w:ascii="Markazi Text" w:cs="Markazi Text" w:eastAsia="Markazi Text" w:hAnsi="Markazi Text"/>
+                <w:rFonts w:ascii="Arakom" w:cs="Arakom" w:eastAsia="Arakom" w:hAnsi="Arakom"/>
                 <w:b w:val="false"/>
                 <w:bCs w:val="false"/>
                 <w:color w:val="111111"/>
@@ -1449,7 +1449,7 @@
             </w:r>
             <w:r>
               <w:rPr>
-                <w:rFonts w:ascii="Markazi Text" w:cs="Markazi Text" w:eastAsia="Markazi Text" w:hAnsi="Markazi Text"/>
+                <w:rFonts w:ascii="Arakom" w:cs="Arakom" w:eastAsia="Arakom" w:hAnsi="Arakom"/>
                 <w:b w:val="false"/>
                 <w:bCs w:val="false"/>
                 <w:color w:val="111111"/>
@@ -1498,7 +1498,7 @@
             </w:r>
             <w:r>
               <w:rPr>
-                <w:rFonts w:ascii="Markazi Text" w:cs="Markazi Text" w:eastAsia="Markazi Text" w:hAnsi="Markazi Text"/>
+                <w:rFonts w:ascii="Arakom" w:cs="Arakom" w:eastAsia="Arakom" w:hAnsi="Arakom"/>
                 <w:b w:val="false"/>
                 <w:bCs w:val="false"/>
                 <w:color w:val="111111"/>
@@ -1889,7 +1889,7 @@
             </w:pPr>
             <w:r>
               <w:rPr>
-                <w:rFonts w:ascii="Markazi Text" w:cs="Markazi Text" w:eastAsia="Markazi Text" w:hAnsi="Markazi Text"/>
+                <w:rFonts w:ascii="Arakom" w:cs="Arakom" w:eastAsia="Arakom" w:hAnsi="Arakom"/>
                 <w:b w:val="false"/>
                 <w:bCs w:val="false"/>
                 <w:color w:val="111111"/>
@@ -2015,7 +2015,7 @@
             </w:pPr>
             <w:r>
               <w:rPr>
-                <w:rFonts w:ascii="Markazi Text" w:cs="Markazi Text" w:eastAsia="Markazi Text" w:hAnsi="Markazi Text"/>
+                <w:rFonts w:ascii="Arakom" w:cs="Arakom" w:eastAsia="Arakom" w:hAnsi="Arakom"/>
                 <w:b w:val="false"/>
                 <w:bCs w:val="false"/>
                 <w:color w:val="111111"/>
@@ -2141,7 +2141,7 @@
             </w:pPr>
             <w:r>
               <w:rPr>
-                <w:rFonts w:ascii="Markazi Text" w:cs="Markazi Text" w:eastAsia="Markazi Text" w:hAnsi="Markazi Text"/>
+                <w:rFonts w:ascii="Arakom" w:cs="Arakom" w:eastAsia="Arakom" w:hAnsi="Arakom"/>
                 <w:b w:val="false"/>
                 <w:bCs w:val="false"/>
                 <w:color w:val="111111"/>
@@ -2267,7 +2267,7 @@
             </w:pPr>
             <w:r>
               <w:rPr>
-                <w:rFonts w:ascii="Markazi Text" w:cs="Markazi Text" w:eastAsia="Markazi Text" w:hAnsi="Markazi Text"/>
+                <w:rFonts w:ascii="Arakom" w:cs="Arakom" w:eastAsia="Arakom" w:hAnsi="Arakom"/>
                 <w:b w:val="false"/>
                 <w:bCs w:val="false"/>
                 <w:color w:val="111111"/>
@@ -2393,7 +2393,7 @@
             </w:pPr>
             <w:r>
               <w:rPr>
-                <w:rFonts w:ascii="Markazi Text" w:cs="Markazi Text" w:eastAsia="Markazi Text" w:hAnsi="Markazi Text"/>
+                <w:rFonts w:ascii="Arakom" w:cs="Arakom" w:eastAsia="Arakom" w:hAnsi="Arakom"/>
                 <w:b w:val="false"/>
                 <w:bCs w:val="false"/>
                 <w:color w:val="111111"/>
@@ -2629,7 +2629,7 @@
             </w:r>
             <w:r>
               <w:rPr>
-                <w:rFonts w:ascii="Markazi Text" w:cs="Markazi Text" w:eastAsia="Markazi Text" w:hAnsi="Markazi Text"/>
+                <w:rFonts w:ascii="Arakom" w:cs="Arakom" w:eastAsia="Arakom" w:hAnsi="Arakom"/>
                 <w:b w:val="false"/>
                 <w:bCs w:val="false"/>
                 <w:color w:val="111111"/>
@@ -2679,7 +2679,7 @@
             </w:r>
             <w:r>
               <w:rPr>
-                <w:rFonts w:ascii="Markazi Text" w:cs="Markazi Text" w:eastAsia="Markazi Text" w:hAnsi="Markazi Text"/>
+                <w:rFonts w:ascii="Arakom" w:cs="Arakom" w:eastAsia="Arakom" w:hAnsi="Arakom"/>
                 <w:b w:val="false"/>
                 <w:bCs w:val="false"/>
                 <w:color w:val="111111"/>
@@ -2734,7 +2734,7 @@
             </w:r>
             <w:r>
               <w:rPr>
-                <w:rFonts w:ascii="Markazi Text" w:cs="Markazi Text" w:eastAsia="Markazi Text" w:hAnsi="Markazi Text"/>
+                <w:rFonts w:ascii="Arakom" w:cs="Arakom" w:eastAsia="Arakom" w:hAnsi="Arakom"/>
                 <w:b w:val="false"/>
                 <w:bCs w:val="false"/>
                 <w:color w:val="111111"/>
@@ -2784,7 +2784,7 @@
             </w:r>
             <w:r>
               <w:rPr>
-                <w:rFonts w:ascii="Markazi Text" w:cs="Markazi Text" w:eastAsia="Markazi Text" w:hAnsi="Markazi Text"/>
+                <w:rFonts w:ascii="Arakom" w:cs="Arakom" w:eastAsia="Arakom" w:hAnsi="Arakom"/>
                 <w:b w:val="false"/>
                 <w:bCs w:val="false"/>
                 <w:color w:val="111111"/>
@@ -2876,7 +2876,7 @@
             </w:r>
             <w:r>
               <w:rPr>
-                <w:rFonts w:ascii="Markazi Text" w:cs="Markazi Text" w:eastAsia="Markazi Text" w:hAnsi="Markazi Text"/>
+                <w:rFonts w:ascii="Arakom" w:cs="Arakom" w:eastAsia="Arakom" w:hAnsi="Arakom"/>
                 <w:b w:val="false"/>
                 <w:bCs w:val="false"/>
                 <w:color w:val="111111"/>
@@ -2926,7 +2926,7 @@
             </w:r>
             <w:r>
               <w:rPr>
-                <w:rFonts w:ascii="Markazi Text" w:cs="Markazi Text" w:eastAsia="Markazi Text" w:hAnsi="Markazi Text"/>
+                <w:rFonts w:ascii="Arakom" w:cs="Arakom" w:eastAsia="Arakom" w:hAnsi="Arakom"/>
                 <w:b w:val="false"/>
                 <w:bCs w:val="false"/>
                 <w:color w:val="111111"/>
@@ -2981,7 +2981,7 @@
             </w:r>
             <w:r>
               <w:rPr>
-                <w:rFonts w:ascii="Markazi Text" w:cs="Markazi Text" w:eastAsia="Markazi Text" w:hAnsi="Markazi Text"/>
+                <w:rFonts w:ascii="Arakom" w:cs="Arakom" w:eastAsia="Arakom" w:hAnsi="Arakom"/>
                 <w:b w:val="false"/>
                 <w:bCs w:val="false"/>
                 <w:color w:val="111111"/>
@@ -3031,7 +3031,7 @@
             </w:r>
             <w:r>
               <w:rPr>
-                <w:rFonts w:ascii="Markazi Text" w:cs="Markazi Text" w:eastAsia="Markazi Text" w:hAnsi="Markazi Text"/>
+                <w:rFonts w:ascii="Arakom" w:cs="Arakom" w:eastAsia="Arakom" w:hAnsi="Arakom"/>
                 <w:b w:val="false"/>
                 <w:bCs w:val="false"/>
                 <w:color w:val="111111"/>
@@ -3123,7 +3123,7 @@
             </w:r>
             <w:r>
               <w:rPr>
-                <w:rFonts w:ascii="Markazi Text" w:cs="Markazi Text" w:eastAsia="Markazi Text" w:hAnsi="Markazi Text"/>
+                <w:rFonts w:ascii="Arakom" w:cs="Arakom" w:eastAsia="Arakom" w:hAnsi="Arakom"/>
                 <w:b w:val="false"/>
                 <w:bCs w:val="false"/>
                 <w:color w:val="111111"/>
@@ -3173,7 +3173,7 @@
             </w:r>
             <w:r>
               <w:rPr>
-                <w:rFonts w:ascii="Markazi Text" w:cs="Markazi Text" w:eastAsia="Markazi Text" w:hAnsi="Markazi Text"/>
+                <w:rFonts w:ascii="Arakom" w:cs="Arakom" w:eastAsia="Arakom" w:hAnsi="Arakom"/>
                 <w:b w:val="false"/>
                 <w:bCs w:val="false"/>
                 <w:color w:val="111111"/>
@@ -3228,7 +3228,7 @@
             </w:r>
             <w:r>
               <w:rPr>
-                <w:rFonts w:ascii="Markazi Text" w:cs="Markazi Text" w:eastAsia="Markazi Text" w:hAnsi="Markazi Text"/>
+                <w:rFonts w:ascii="Arakom" w:cs="Arakom" w:eastAsia="Arakom" w:hAnsi="Arakom"/>
                 <w:b w:val="false"/>
                 <w:bCs w:val="false"/>
                 <w:color w:val="111111"/>
@@ -3278,7 +3278,7 @@
             </w:r>
             <w:r>
               <w:rPr>
-                <w:rFonts w:ascii="Markazi Text" w:cs="Markazi Text" w:eastAsia="Markazi Text" w:hAnsi="Markazi Text"/>
+                <w:rFonts w:ascii="Arakom" w:cs="Arakom" w:eastAsia="Arakom" w:hAnsi="Arakom"/>
                 <w:b w:val="false"/>
                 <w:bCs w:val="false"/>
                 <w:color w:val="111111"/>
@@ -3370,7 +3370,7 @@
             </w:r>
             <w:r>
               <w:rPr>
-                <w:rFonts w:ascii="Markazi Text" w:cs="Markazi Text" w:eastAsia="Markazi Text" w:hAnsi="Markazi Text"/>
+                <w:rFonts w:ascii="Arakom" w:cs="Arakom" w:eastAsia="Arakom" w:hAnsi="Arakom"/>
                 <w:b w:val="false"/>
                 <w:bCs w:val="false"/>
                 <w:color w:val="111111"/>
@@ -3420,7 +3420,7 @@
             </w:r>
             <w:r>
               <w:rPr>
-                <w:rFonts w:ascii="Markazi Text" w:cs="Markazi Text" w:eastAsia="Markazi Text" w:hAnsi="Markazi Text"/>
+                <w:rFonts w:ascii="Arakom" w:cs="Arakom" w:eastAsia="Arakom" w:hAnsi="Arakom"/>
                 <w:b w:val="false"/>
                 <w:bCs w:val="false"/>
                 <w:color w:val="111111"/>
@@ -3475,7 +3475,7 @@
             </w:r>
             <w:r>
               <w:rPr>
-                <w:rFonts w:ascii="Markazi Text" w:cs="Markazi Text" w:eastAsia="Markazi Text" w:hAnsi="Markazi Text"/>
+                <w:rFonts w:ascii="Arakom" w:cs="Arakom" w:eastAsia="Arakom" w:hAnsi="Arakom"/>
                 <w:b w:val="false"/>
                 <w:bCs w:val="false"/>
                 <w:color w:val="111111"/>
@@ -3525,7 +3525,7 @@
             </w:r>
             <w:r>
               <w:rPr>
-                <w:rFonts w:ascii="Markazi Text" w:cs="Markazi Text" w:eastAsia="Markazi Text" w:hAnsi="Markazi Text"/>
+                <w:rFonts w:ascii="Arakom" w:cs="Arakom" w:eastAsia="Arakom" w:hAnsi="Arakom"/>
                 <w:b w:val="false"/>
                 <w:bCs w:val="false"/>
                 <w:color w:val="111111"/>
@@ -4042,7 +4042,7 @@
             </w:pPr>
             <w:r>
               <w:rPr>
-                <w:rFonts w:ascii="Markazi Text" w:cs="Markazi Text" w:eastAsia="Markazi Text" w:hAnsi="Markazi Text"/>
+                <w:rFonts w:ascii="Arakom" w:cs="Arakom" w:eastAsia="Arakom" w:hAnsi="Arakom"/>
                 <w:b w:val="false"/>
                 <w:bCs w:val="false"/>
                 <w:color w:val="111111"/>
@@ -4212,7 +4212,7 @@
             </w:pPr>
             <w:r>
               <w:rPr>
-                <w:rFonts w:ascii="Markazi Text" w:cs="Markazi Text" w:eastAsia="Markazi Text" w:hAnsi="Markazi Text"/>
+                <w:rFonts w:ascii="Arakom" w:cs="Arakom" w:eastAsia="Arakom" w:hAnsi="Arakom"/>
                 <w:b w:val="false"/>
                 <w:bCs w:val="false"/>
                 <w:color w:val="111111"/>
@@ -4382,7 +4382,7 @@
             </w:pPr>
             <w:r>
               <w:rPr>
-                <w:rFonts w:ascii="Markazi Text" w:cs="Markazi Text" w:eastAsia="Markazi Text" w:hAnsi="Markazi Text"/>
+                <w:rFonts w:ascii="Arakom" w:cs="Arakom" w:eastAsia="Arakom" w:hAnsi="Arakom"/>
                 <w:b w:val="false"/>
                 <w:bCs w:val="false"/>
                 <w:color w:val="111111"/>
@@ -4552,7 +4552,7 @@
             </w:pPr>
             <w:r>
               <w:rPr>
-                <w:rFonts w:ascii="Markazi Text" w:cs="Markazi Text" w:eastAsia="Markazi Text" w:hAnsi="Markazi Text"/>
+                <w:rFonts w:ascii="Arakom" w:cs="Arakom" w:eastAsia="Arakom" w:hAnsi="Arakom"/>
                 <w:b w:val="false"/>
                 <w:bCs w:val="false"/>
                 <w:color w:val="111111"/>
@@ -4722,7 +4722,7 @@
             </w:pPr>
             <w:r>
               <w:rPr>
-                <w:rFonts w:ascii="Markazi Text" w:cs="Markazi Text" w:eastAsia="Markazi Text" w:hAnsi="Markazi Text"/>
+                <w:rFonts w:ascii="Arakom" w:cs="Arakom" w:eastAsia="Arakom" w:hAnsi="Arakom"/>
                 <w:b w:val="false"/>
                 <w:bCs w:val="false"/>
                 <w:color w:val="111111"/>
@@ -4874,7 +4874,7 @@
             </w:pPr>
             <w:r>
               <w:rPr>
-                <w:rFonts w:ascii="Markazi Text" w:cs="Markazi Text" w:eastAsia="Markazi Text" w:hAnsi="Markazi Text"/>
+                <w:rFonts w:ascii="Arakom" w:cs="Arakom" w:eastAsia="Arakom" w:hAnsi="Arakom"/>
                 <w:b w:val="false"/>
                 <w:bCs w:val="false"/>
                 <w:color w:val="111111"/>
@@ -4981,7 +4981,7 @@
             </w:pPr>
             <w:r>
               <w:rPr>
-                <w:rFonts w:ascii="Markazi Text" w:cs="Markazi Text" w:eastAsia="Markazi Text" w:hAnsi="Markazi Text"/>
+                <w:rFonts w:ascii="Arakom" w:cs="Arakom" w:eastAsia="Arakom" w:hAnsi="Arakom"/>
                 <w:b w:val="false"/>
                 <w:bCs w:val="false"/>
                 <w:color w:val="111111"/>
@@ -5053,7 +5053,7 @@
             </w:pPr>
             <w:r>
               <w:rPr>
-                <w:rFonts w:ascii="Markazi Text" w:cs="Markazi Text" w:eastAsia="Markazi Text" w:hAnsi="Markazi Text"/>
+                <w:rFonts w:ascii="Arakom" w:cs="Arakom" w:eastAsia="Arakom" w:hAnsi="Arakom"/>
                 <w:b w:val="false"/>
                 <w:bCs w:val="false"/>
                 <w:color w:val="111111"/>
@@ -5125,7 +5125,7 @@
             </w:pPr>
             <w:r>
               <w:rPr>
-                <w:rFonts w:ascii="Markazi Text" w:cs="Markazi Text" w:eastAsia="Markazi Text" w:hAnsi="Markazi Text"/>
+                <w:rFonts w:ascii="Arakom" w:cs="Arakom" w:eastAsia="Arakom" w:hAnsi="Arakom"/>
                 <w:b w:val="false"/>
                 <w:bCs w:val="false"/>
                 <w:color w:val="111111"/>
@@ -5197,7 +5197,7 @@
             </w:pPr>
             <w:r>
               <w:rPr>
-                <w:rFonts w:ascii="Markazi Text" w:cs="Markazi Text" w:eastAsia="Markazi Text" w:hAnsi="Markazi Text"/>
+                <w:rFonts w:ascii="Arakom" w:cs="Arakom" w:eastAsia="Arakom" w:hAnsi="Arakom"/>
                 <w:b w:val="false"/>
                 <w:bCs w:val="false"/>
                 <w:color w:val="111111"/>
@@ -5269,7 +5269,7 @@
             </w:pPr>
             <w:r>
               <w:rPr>
-                <w:rFonts w:ascii="Markazi Text" w:cs="Markazi Text" w:eastAsia="Markazi Text" w:hAnsi="Markazi Text"/>
+                <w:rFonts w:ascii="Arakom" w:cs="Arakom" w:eastAsia="Arakom" w:hAnsi="Arakom"/>
                 <w:b w:val="false"/>
                 <w:bCs w:val="false"/>
                 <w:color w:val="111111"/>
@@ -5539,7 +5539,7 @@
             </w:pPr>
             <w:r>
               <w:rPr>
-                <w:rFonts w:ascii="Markazi Text" w:cs="Markazi Text" w:eastAsia="Markazi Text" w:hAnsi="Markazi Text"/>
+                <w:rFonts w:ascii="Arakom" w:cs="Arakom" w:eastAsia="Arakom" w:hAnsi="Arakom"/>
                 <w:b w:val="false"/>
                 <w:bCs w:val="false"/>
                 <w:color w:val="111111"/>
@@ -5636,7 +5636,7 @@
             </w:pPr>
             <w:r>
               <w:rPr>
-                <w:rFonts w:ascii="Markazi Text" w:cs="Markazi Text" w:eastAsia="Markazi Text" w:hAnsi="Markazi Text"/>
+                <w:rFonts w:ascii="Arakom" w:cs="Arakom" w:eastAsia="Arakom" w:hAnsi="Arakom"/>
                 <w:b w:val="false"/>
                 <w:bCs w:val="false"/>
                 <w:color w:val="111111"/>
@@ -5733,7 +5733,7 @@
             </w:pPr>
             <w:r>
               <w:rPr>
-                <w:rFonts w:ascii="Markazi Text" w:cs="Markazi Text" w:eastAsia="Markazi Text" w:hAnsi="Markazi Text"/>
+                <w:rFonts w:ascii="Arakom" w:cs="Arakom" w:eastAsia="Arakom" w:hAnsi="Arakom"/>
                 <w:b w:val="false"/>
                 <w:bCs w:val="false"/>
                 <w:color w:val="111111"/>
@@ -5830,7 +5830,7 @@
             </w:pPr>
             <w:r>
               <w:rPr>
-                <w:rFonts w:ascii="Markazi Text" w:cs="Markazi Text" w:eastAsia="Markazi Text" w:hAnsi="Markazi Text"/>
+                <w:rFonts w:ascii="Arakom" w:cs="Arakom" w:eastAsia="Arakom" w:hAnsi="Arakom"/>
                 <w:b w:val="false"/>
                 <w:bCs w:val="false"/>
                 <w:color w:val="111111"/>
@@ -5927,7 +5927,7 @@
             </w:pPr>
             <w:r>
               <w:rPr>
-                <w:rFonts w:ascii="Markazi Text" w:cs="Markazi Text" w:eastAsia="Markazi Text" w:hAnsi="Markazi Text"/>
+                <w:rFonts w:ascii="Arakom" w:cs="Arakom" w:eastAsia="Arakom" w:hAnsi="Arakom"/>
                 <w:b w:val="false"/>
                 <w:bCs w:val="false"/>
                 <w:color w:val="111111"/>
@@ -6256,7 +6256,7 @@
             </w:pPr>
             <w:r>
               <w:rPr>
-                <w:rFonts w:ascii="Markazi Text" w:cs="Markazi Text" w:eastAsia="Markazi Text" w:hAnsi="Markazi Text"/>
+                <w:rFonts w:ascii="Arakom" w:cs="Arakom" w:eastAsia="Arakom" w:hAnsi="Arakom"/>
                 <w:b w:val="false"/>
                 <w:bCs w:val="false"/>
                 <w:color w:val="111111"/>
@@ -6352,7 +6352,7 @@
             </w:pPr>
             <w:r>
               <w:rPr>
-                <w:rFonts w:ascii="Markazi Text" w:cs="Markazi Text" w:eastAsia="Markazi Text" w:hAnsi="Markazi Text"/>
+                <w:rFonts w:ascii="Arakom" w:cs="Arakom" w:eastAsia="Arakom" w:hAnsi="Arakom"/>
                 <w:b w:val="false"/>
                 <w:bCs w:val="false"/>
                 <w:color w:val="111111"/>
@@ -6448,7 +6448,7 @@
             </w:pPr>
             <w:r>
               <w:rPr>
-                <w:rFonts w:ascii="Markazi Text" w:cs="Markazi Text" w:eastAsia="Markazi Text" w:hAnsi="Markazi Text"/>
+                <w:rFonts w:ascii="Arakom" w:cs="Arakom" w:eastAsia="Arakom" w:hAnsi="Arakom"/>
                 <w:b w:val="false"/>
                 <w:bCs w:val="false"/>
                 <w:color w:val="111111"/>
@@ -6544,7 +6544,7 @@
             </w:pPr>
             <w:r>
               <w:rPr>
-                <w:rFonts w:ascii="Markazi Text" w:cs="Markazi Text" w:eastAsia="Markazi Text" w:hAnsi="Markazi Text"/>
+                <w:rFonts w:ascii="Arakom" w:cs="Arakom" w:eastAsia="Arakom" w:hAnsi="Arakom"/>
                 <w:b w:val="false"/>
                 <w:bCs w:val="false"/>
                 <w:color w:val="111111"/>
@@ -6640,7 +6640,7 @@
             </w:pPr>
             <w:r>
               <w:rPr>
-                <w:rFonts w:ascii="Markazi Text" w:cs="Markazi Text" w:eastAsia="Markazi Text" w:hAnsi="Markazi Text"/>
+                <w:rFonts w:ascii="Arakom" w:cs="Arakom" w:eastAsia="Arakom" w:hAnsi="Arakom"/>
                 <w:b w:val="false"/>
                 <w:bCs w:val="false"/>
                 <w:color w:val="111111"/>
@@ -6792,7 +6792,7 @@
             </w:pPr>
             <w:r>
               <w:rPr>
-                <w:rFonts w:ascii="Markazi Text" w:cs="Markazi Text" w:eastAsia="Markazi Text" w:hAnsi="Markazi Text"/>
+                <w:rFonts w:ascii="Arakom" w:cs="Arakom" w:eastAsia="Arakom" w:hAnsi="Arakom"/>
                 <w:b w:val="false"/>
                 <w:bCs w:val="false"/>
                 <w:color w:val="111111"/>
@@ -7754,7 +7754,7 @@
             </w:pPr>
             <w:r>
               <w:rPr>
-                <w:rFonts w:ascii="Markazi Text" w:cs="Markazi Text" w:eastAsia="Markazi Text" w:hAnsi="Markazi Text"/>
+                <w:rFonts w:ascii="Arakom" w:cs="Arakom" w:eastAsia="Arakom" w:hAnsi="Arakom"/>
                 <w:b w:val="false"/>
                 <w:bCs w:val="false"/>
                 <w:color w:val="111111"/>
@@ -7942,7 +7942,7 @@
             </w:pPr>
             <w:r>
               <w:rPr>
-                <w:rFonts w:ascii="Markazi Text" w:cs="Markazi Text" w:eastAsia="Markazi Text" w:hAnsi="Markazi Text"/>
+                <w:rFonts w:ascii="Arakom" w:cs="Arakom" w:eastAsia="Arakom" w:hAnsi="Arakom"/>
                 <w:b w:val="false"/>
                 <w:bCs w:val="false"/>
                 <w:color w:val="111111"/>
@@ -7960,7 +7960,7 @@
             </w:pPr>
             <w:r>
               <w:rPr>
-                <w:rFonts w:ascii="Markazi Text" w:cs="Markazi Text" w:eastAsia="Markazi Text" w:hAnsi="Markazi Text"/>
+                <w:rFonts w:ascii="Arakom" w:cs="Arakom" w:eastAsia="Arakom" w:hAnsi="Arakom"/>
                 <w:b w:val="false"/>
                 <w:bCs w:val="false"/>
                 <w:color w:val="111111"/>

</xml_diff>